<commit_message>
JNO: dedup keywords, split text-only manuscript + separate legends, cover letter contact info
</commit_message>
<xml_diff>
--- a/submission_JNO/Cover_Letter/01_Cover_Letter_JNO.docx
+++ b/submission_JNO/Cover_Letter/01_Cover_Letter_JNO.docx
@@ -89,13 +89,19 @@
         <w:t xml:space="preserve"> </w:t>
       </w:r>
       <w:r>
-        <w:t xml:space="preserve">Department of Bioinformatics, Chengdu Neusoft University, Chengdu, China</w:t>
+        <w:t xml:space="preserve">Department of Bioinformatics, Chengdu Neusoft University</w:t>
       </w:r>
       <w:r>
         <w:t xml:space="preserve"> </w:t>
       </w:r>
       <w:r>
-        <w:t xml:space="preserve">Email: 1176625889@qq.com</w:t>
+        <w:t xml:space="preserve">No. 1 Dongruan Avenue, Chengdu, Sichuan 611844, China</w:t>
+      </w:r>
+      <w:r>
+        <w:t xml:space="preserve"> </w:t>
+      </w:r>
+      <w:r>
+        <w:t xml:space="preserve">Phone: [to be added] | Email: 1176625889@qq.com</w:t>
       </w:r>
     </w:p>
     <w:sectPr>
@@ -242,7 +248,8 @@
     <w:link w:val="BodyTextChar"/>
     <w:qFormat/>
     <w:pPr>
-      <w:spacing w:before="180" w:after="180"/>
+      <w:spacing w:line="480" w:lineRule="auto"/>
+      <w:jc w:val="both"/>
     </w:pPr>
   </w:style>
   <w:style w:type="paragraph" w:customStyle="1" w:styleId="FirstParagraph">
@@ -273,6 +280,8 @@
       <w:jc w:val="center"/>
     </w:pPr>
     <w:rPr>
+      <w:sz w:val="24"/>
+      <w:szCs w:val="24"/>
       <w:rFonts w:asciiTheme="majorHAnsi" w:eastAsiaTheme="majorEastAsia" w:hAnsiTheme="majorHAnsi" w:cstheme="majorBidi"/>
       <w:sz w:val="56"/>
       <w:szCs w:val="56"/>

</xml_diff>